<commit_message>
finished chapter 2.1; Added chapter 2.2 and 2.2.1
</commit_message>
<xml_diff>
--- a/docs/report/smartpowerbank.docx
+++ b/docs/report/smartpowerbank.docx
@@ -43,7 +43,7 @@
                     </pic:cNvPicPr>
                   </pic:nvPicPr>
                   <pic:blipFill>
-                    <a:blip r:embed="rId7" cstate="print">
+                    <a:blip r:embed="rId8" cstate="print">
                       <a:extLst>
                         <a:ext uri="{28A0092B-C50C-407E-A947-70E740481C1C}">
                           <a14:useLocalDpi xmlns:a14="http://schemas.microsoft.com/office/drawing/2010/main" val="0"/>
@@ -141,25 +141,7 @@
           <w:sz w:val="28"/>
           <w:szCs w:val="28"/>
         </w:rPr>
-        <w:t xml:space="preserve"> </w:t>
-      </w:r>
-      <w:proofErr w:type="spellStart"/>
-      <w:r>
-        <w:rPr>
-          <w:rFonts w:ascii="Calibri" w:hAnsi="Calibri" w:cs="Calibri"/>
-          <w:sz w:val="28"/>
-          <w:szCs w:val="28"/>
-        </w:rPr>
-        <w:t>Sayfutdinov</w:t>
-      </w:r>
-      <w:proofErr w:type="spellEnd"/>
-      <w:r>
-        <w:rPr>
-          <w:rFonts w:ascii="Calibri" w:hAnsi="Calibri" w:cs="Calibri"/>
-          <w:sz w:val="28"/>
-          <w:szCs w:val="28"/>
-        </w:rPr>
-        <w:t xml:space="preserve"> David</w:t>
+        <w:t xml:space="preserve"> Sayfutdinov David</w:t>
       </w:r>
     </w:p>
     <w:p>
@@ -605,8 +587,8 @@
           <w:rFonts w:ascii="Calibri" w:hAnsi="Calibri" w:cs="Calibri"/>
         </w:rPr>
         <w:sectPr>
-          <w:headerReference w:type="default" r:id="rId8"/>
-          <w:footerReference w:type="default" r:id="rId9"/>
+          <w:headerReference w:type="default" r:id="rId9"/>
+          <w:footerReference w:type="default" r:id="rId10"/>
           <w:pgSz w:w="11906" w:h="16838"/>
           <w:pgMar w:top="1417" w:right="1417" w:bottom="1134" w:left="1417" w:header="708" w:footer="708" w:gutter="0"/>
           <w:pgNumType w:start="0"/>
@@ -1229,8 +1211,8 @@
           <w:szCs w:val="32"/>
         </w:rPr>
         <w:sectPr>
-          <w:headerReference w:type="first" r:id="rId10"/>
-          <w:footerReference w:type="first" r:id="rId11"/>
+          <w:headerReference w:type="first" r:id="rId11"/>
+          <w:footerReference w:type="first" r:id="rId12"/>
           <w:pgSz w:w="11906" w:h="16838"/>
           <w:pgMar w:top="1417" w:right="1417" w:bottom="1134" w:left="1417" w:header="708" w:footer="708" w:gutter="0"/>
           <w:pgNumType w:start="1"/>
@@ -1583,14 +1565,12 @@
         </w:rPr>
         <w:t xml:space="preserve"> </w:t>
       </w:r>
-      <w:proofErr w:type="spellStart"/>
       <w:r>
         <w:rPr>
           <w:rFonts w:ascii="Calibri" w:hAnsi="Calibri" w:cs="Calibri"/>
         </w:rPr>
         <w:t>mAh</w:t>
       </w:r>
-      <w:proofErr w:type="spellEnd"/>
       <w:r>
         <w:rPr>
           <w:rFonts w:ascii="Calibri" w:hAnsi="Calibri" w:cs="Calibri"/>
@@ -1851,101 +1831,65 @@
           <w:b/>
           <w:bCs/>
         </w:rPr>
-        <w:t>Implementierung des USB-C Power-</w:t>
-      </w:r>
-      <w:proofErr w:type="spellStart"/>
+        <w:t>Implementierung des USB-C Power-Delivery-(PD)-Protokolls</w:t>
+      </w:r>
+      <w:r>
+        <w:rPr>
+          <w:rFonts w:ascii="Calibri" w:hAnsi="Calibri" w:cs="Calibri"/>
+        </w:rPr>
+        <w:br/>
+        <w:t>Die Ausgangsspannung wird bewusst auf eine feste 5V-Versorgung mit maximal 3A begrenzt. Die Umsetzung variabler Spannungsprofile gemäß USB-PD würde zusätzliche Protokoll-Controller sowie eine deutlich komplexere Leistungsregelung erfordern und liegt außerhalb des definierten Projektumfangs.</w:t>
+      </w:r>
+    </w:p>
+    <w:p>
+      <w:pPr>
+        <w:spacing w:after="120" w:line="276" w:lineRule="auto"/>
+        <w:rPr>
+          <w:rFonts w:ascii="Calibri" w:hAnsi="Calibri" w:cs="Calibri"/>
+        </w:rPr>
+      </w:pPr>
       <w:r>
         <w:rPr>
           <w:rFonts w:ascii="Calibri" w:hAnsi="Calibri" w:cs="Calibri"/>
           <w:b/>
           <w:bCs/>
         </w:rPr>
-        <w:t>Delivery</w:t>
-      </w:r>
-      <w:proofErr w:type="spellEnd"/>
+        <w:t>– Nutzung des ESP8266 als Router oder Internet-Gateway</w:t>
+      </w:r>
       <w:r>
         <w:rPr>
           <w:rFonts w:ascii="Calibri" w:hAnsi="Calibri" w:cs="Calibri"/>
           <w:b/>
           <w:bCs/>
         </w:rPr>
-        <w:t>-(</w:t>
-      </w:r>
-      <w:proofErr w:type="gramStart"/>
+        <w:br/>
+      </w:r>
+      <w:r>
+        <w:rPr>
+          <w:rFonts w:ascii="Calibri" w:hAnsi="Calibri" w:cs="Calibri"/>
+        </w:rPr>
+        <w:t>Der ESP8266 dient ausschließlich zur Bereitstellung eines lokalen Access Points und zur Anzeige der webbasierten Benutzeroberfläche. Eine Weiterleitung von Internetverkehr oder eine Nutzung als Netzwerkinfrastrukturkomponente ist nicht vorgesehen.</w:t>
+      </w:r>
+    </w:p>
+    <w:p>
+      <w:pPr>
+        <w:spacing w:after="120" w:line="276" w:lineRule="auto"/>
+        <w:rPr>
+          <w:rFonts w:ascii="Calibri" w:hAnsi="Calibri" w:cs="Calibri"/>
+        </w:rPr>
+      </w:pPr>
+      <w:r>
+        <w:rPr>
+          <w:rFonts w:ascii="Calibri" w:hAnsi="Calibri" w:cs="Calibri"/>
+        </w:rPr>
+        <w:t xml:space="preserve">– </w:t>
+      </w:r>
       <w:r>
         <w:rPr>
           <w:rFonts w:ascii="Calibri" w:hAnsi="Calibri" w:cs="Calibri"/>
           <w:b/>
           <w:bCs/>
         </w:rPr>
-        <w:t>PD)-</w:t>
-      </w:r>
-      <w:proofErr w:type="gramEnd"/>
-      <w:r>
-        <w:rPr>
-          <w:rFonts w:ascii="Calibri" w:hAnsi="Calibri" w:cs="Calibri"/>
-          <w:b/>
-          <w:bCs/>
-        </w:rPr>
-        <w:t>Protokolls</w:t>
-      </w:r>
-      <w:r>
-        <w:rPr>
-          <w:rFonts w:ascii="Calibri" w:hAnsi="Calibri" w:cs="Calibri"/>
-        </w:rPr>
-        <w:br/>
-        <w:t>Die Ausgangsspannung wird bewusst auf eine feste 5V-Versorgung mit maximal 3A begrenzt. Die Umsetzung variabler Spannungsprofile gemäß USB-PD würde zusätzliche Protokoll-Controller sowie eine deutlich komplexere Leistungsregelung erfordern und liegt außerhalb des definierten Projektumfangs.</w:t>
-      </w:r>
-    </w:p>
-    <w:p>
-      <w:pPr>
-        <w:spacing w:after="120" w:line="276" w:lineRule="auto"/>
-        <w:rPr>
-          <w:rFonts w:ascii="Calibri" w:hAnsi="Calibri" w:cs="Calibri"/>
-        </w:rPr>
-      </w:pPr>
-      <w:r>
-        <w:rPr>
-          <w:rFonts w:ascii="Calibri" w:hAnsi="Calibri" w:cs="Calibri"/>
-          <w:b/>
-          <w:bCs/>
-        </w:rPr>
-        <w:t>– Nutzung des ESP8266 als Router oder Internet-Gateway</w:t>
-      </w:r>
-      <w:r>
-        <w:rPr>
-          <w:rFonts w:ascii="Calibri" w:hAnsi="Calibri" w:cs="Calibri"/>
-          <w:b/>
-          <w:bCs/>
-        </w:rPr>
-        <w:br/>
-      </w:r>
-      <w:r>
-        <w:rPr>
-          <w:rFonts w:ascii="Calibri" w:hAnsi="Calibri" w:cs="Calibri"/>
-        </w:rPr>
-        <w:t>Der ESP8266 dient ausschließlich zur Bereitstellung eines lokalen Access Points und zur Anzeige der webbasierten Benutzeroberfläche. Eine Weiterleitung von Internetverkehr oder eine Nutzung als Netzwerkinfrastrukturkomponente ist nicht vorgesehen.</w:t>
-      </w:r>
-    </w:p>
-    <w:p>
-      <w:pPr>
-        <w:spacing w:after="120" w:line="276" w:lineRule="auto"/>
-        <w:rPr>
-          <w:rFonts w:ascii="Calibri" w:hAnsi="Calibri" w:cs="Calibri"/>
-        </w:rPr>
-      </w:pPr>
-      <w:r>
-        <w:rPr>
-          <w:rFonts w:ascii="Calibri" w:hAnsi="Calibri" w:cs="Calibri"/>
-        </w:rPr>
-        <w:t xml:space="preserve">– </w:t>
-      </w:r>
-      <w:r>
-        <w:rPr>
-          <w:rFonts w:ascii="Calibri" w:hAnsi="Calibri" w:cs="Calibri"/>
-          <w:b/>
-          <w:bCs/>
-        </w:rPr>
         <w:t>Smartphone-App-Entwicklung</w:t>
       </w:r>
       <w:r>
@@ -1977,7 +1921,19 @@
         <w:rPr>
           <w:rFonts w:ascii="Calibri" w:hAnsi="Calibri" w:cs="Calibri"/>
         </w:rPr>
-        <w:t xml:space="preserve"> ein webbasiertes Interface. Die Entwicklung einer nativen Android- oder iOS-App ist nicht Teil des Projekts.</w:t>
+        <w:t xml:space="preserve"> ein webbasiertes Interface. Die Entwicklung einer </w:t>
+      </w:r>
+      <w:r>
+        <w:rPr>
+          <w:rFonts w:ascii="Calibri" w:hAnsi="Calibri" w:cs="Calibri"/>
+        </w:rPr>
+        <w:t>Smartphone-</w:t>
+      </w:r>
+      <w:r>
+        <w:rPr>
+          <w:rFonts w:ascii="Calibri" w:hAnsi="Calibri" w:cs="Calibri"/>
+        </w:rPr>
+        <w:t>App ist nicht Teil des Projekts.</w:t>
       </w:r>
     </w:p>
     <w:p>
@@ -2150,21 +2106,7 @@
         <w:rPr>
           <w:rFonts w:ascii="Calibri" w:hAnsi="Calibri" w:cs="Calibri"/>
         </w:rPr>
-        <w:t xml:space="preserve">Akkusystem (Akkuzelle, BMS, Laderegler, Fuel </w:t>
-      </w:r>
-      <w:proofErr w:type="spellStart"/>
-      <w:r>
-        <w:rPr>
-          <w:rFonts w:ascii="Calibri" w:hAnsi="Calibri" w:cs="Calibri"/>
-        </w:rPr>
-        <w:t>Cell</w:t>
-      </w:r>
-      <w:proofErr w:type="spellEnd"/>
-      <w:r>
-        <w:rPr>
-          <w:rFonts w:ascii="Calibri" w:hAnsi="Calibri" w:cs="Calibri"/>
-        </w:rPr>
-        <w:t>)</w:t>
+        <w:t>Akkusystem (Akkuzelle, BMS, Laderegler, Fuel Cell)</w:t>
       </w:r>
     </w:p>
     <w:p>
@@ -2174,22 +2116,489 @@
           <w:ilvl w:val="0"/>
           <w:numId w:val="6"/>
         </w:numPr>
-        <w:rPr>
-          <w:rFonts w:ascii="Calibri" w:hAnsi="Calibri" w:cs="Calibri"/>
-        </w:rPr>
-      </w:pPr>
-      <w:r>
-        <w:rPr>
-          <w:rFonts w:ascii="Calibri" w:hAnsi="Calibri" w:cs="Calibri"/>
-        </w:rPr>
-        <w:t xml:space="preserve">DC-DC Wandler für </w:t>
-      </w:r>
-      <w:r>
-        <w:rPr>
-          <w:rFonts w:ascii="Calibri" w:hAnsi="Calibri" w:cs="Calibri"/>
-        </w:rPr>
-        <w:t>5V Ausgangsspannung</w:t>
-      </w:r>
+        <w:spacing w:after="120"/>
+        <w:ind w:left="714" w:hanging="357"/>
+        <w:rPr>
+          <w:rFonts w:ascii="Calibri" w:hAnsi="Calibri" w:cs="Calibri"/>
+        </w:rPr>
+      </w:pPr>
+      <w:r>
+        <w:rPr>
+          <w:rFonts w:ascii="Calibri" w:hAnsi="Calibri" w:cs="Calibri"/>
+        </w:rPr>
+        <w:t>Spannungsregelung für den Ausgang</w:t>
+      </w:r>
+    </w:p>
+    <w:p>
+      <w:pPr>
+        <w:spacing w:after="120"/>
+        <w:rPr>
+          <w:rFonts w:ascii="Calibri" w:hAnsi="Calibri" w:cs="Calibri"/>
+        </w:rPr>
+      </w:pPr>
+      <w:r>
+        <w:rPr>
+          <w:rFonts w:ascii="Calibri" w:hAnsi="Calibri" w:cs="Calibri"/>
+        </w:rPr>
+        <w:t>Zusätzlich zu diesen erfordert dieses Projekt weitere Systeme:</w:t>
+      </w:r>
+    </w:p>
+    <w:p>
+      <w:pPr>
+        <w:pStyle w:val="Listenabsatz"/>
+        <w:numPr>
+          <w:ilvl w:val="0"/>
+          <w:numId w:val="7"/>
+        </w:numPr>
+        <w:rPr>
+          <w:rFonts w:ascii="Calibri" w:hAnsi="Calibri" w:cs="Calibri"/>
+        </w:rPr>
+      </w:pPr>
+      <w:r>
+        <w:rPr>
+          <w:rFonts w:ascii="Calibri" w:hAnsi="Calibri" w:cs="Calibri"/>
+        </w:rPr>
+        <w:t>Spannungs- und Strommessung</w:t>
+      </w:r>
+    </w:p>
+    <w:p>
+      <w:pPr>
+        <w:pStyle w:val="Listenabsatz"/>
+        <w:numPr>
+          <w:ilvl w:val="0"/>
+          <w:numId w:val="7"/>
+        </w:numPr>
+        <w:rPr>
+          <w:rFonts w:ascii="Calibri" w:hAnsi="Calibri" w:cs="Calibri"/>
+        </w:rPr>
+      </w:pPr>
+      <w:r>
+        <w:rPr>
+          <w:rFonts w:ascii="Calibri" w:hAnsi="Calibri" w:cs="Calibri"/>
+        </w:rPr>
+        <w:t>Batterieüberwachung</w:t>
+      </w:r>
+    </w:p>
+    <w:p>
+      <w:pPr>
+        <w:pStyle w:val="Listenabsatz"/>
+        <w:numPr>
+          <w:ilvl w:val="0"/>
+          <w:numId w:val="7"/>
+        </w:numPr>
+        <w:rPr>
+          <w:rFonts w:ascii="Calibri" w:hAnsi="Calibri" w:cs="Calibri"/>
+          <w:lang w:val="en-US"/>
+        </w:rPr>
+      </w:pPr>
+      <w:r>
+        <w:rPr>
+          <w:rFonts w:ascii="Calibri" w:hAnsi="Calibri" w:cs="Calibri"/>
+          <w:lang w:val="en-US"/>
+        </w:rPr>
+        <w:t>Live-Anzeige</w:t>
+      </w:r>
+    </w:p>
+    <w:p>
+      <w:pPr>
+        <w:pStyle w:val="Listenabsatz"/>
+        <w:numPr>
+          <w:ilvl w:val="0"/>
+          <w:numId w:val="7"/>
+        </w:numPr>
+        <w:rPr>
+          <w:rFonts w:ascii="Calibri" w:hAnsi="Calibri" w:cs="Calibri"/>
+        </w:rPr>
+      </w:pPr>
+      <w:r>
+        <w:rPr>
+          <w:rFonts w:ascii="Calibri" w:hAnsi="Calibri" w:cs="Calibri"/>
+          <w:lang w:val="en-US"/>
+        </w:rPr>
+        <w:t>Steuerung</w:t>
+      </w:r>
+    </w:p>
+    <w:p>
+      <w:pPr>
+        <w:pStyle w:val="Listenabsatz"/>
+        <w:numPr>
+          <w:ilvl w:val="0"/>
+          <w:numId w:val="7"/>
+        </w:numPr>
+        <w:spacing w:after="120"/>
+        <w:ind w:left="714" w:hanging="357"/>
+        <w:rPr>
+          <w:rFonts w:ascii="Calibri" w:hAnsi="Calibri" w:cs="Calibri"/>
+        </w:rPr>
+      </w:pPr>
+      <w:r>
+        <w:rPr>
+          <w:rFonts w:ascii="Calibri" w:hAnsi="Calibri" w:cs="Calibri"/>
+        </w:rPr>
+        <w:t>Wi-Fi-Modul für Webserver-Anzeige</w:t>
+      </w:r>
+    </w:p>
+    <w:p>
+      <w:pPr>
+        <w:pStyle w:val="berschrift2"/>
+        <w:rPr>
+          <w:rFonts w:ascii="Calibri" w:hAnsi="Calibri" w:cs="Calibri"/>
+          <w:b/>
+          <w:bCs/>
+          <w:sz w:val="26"/>
+          <w:szCs w:val="26"/>
+        </w:rPr>
+      </w:pPr>
+      <w:r>
+        <w:rPr>
+          <w:rFonts w:ascii="Calibri" w:hAnsi="Calibri" w:cs="Calibri"/>
+          <w:b/>
+          <w:bCs/>
+          <w:sz w:val="26"/>
+          <w:szCs w:val="26"/>
+        </w:rPr>
+        <w:t>2.2 Realisierung</w:t>
+      </w:r>
+    </w:p>
+    <w:p>
+      <w:pPr>
+        <w:rPr>
+          <w:rFonts w:ascii="Calibri" w:hAnsi="Calibri" w:cs="Calibri"/>
+        </w:rPr>
+      </w:pPr>
+      <w:r>
+        <w:rPr>
+          <w:rFonts w:ascii="Calibri" w:hAnsi="Calibri" w:cs="Calibri"/>
+        </w:rPr>
+        <w:t xml:space="preserve">Vorerst veranschaulicht ein Blockschaltbild die </w:t>
+      </w:r>
+      <w:r>
+        <w:rPr>
+          <w:rFonts w:ascii="Calibri" w:hAnsi="Calibri" w:cs="Calibri"/>
+        </w:rPr>
+        <w:t>Zusammenhänge und Kommunikation der Systeme</w:t>
+      </w:r>
+      <w:r>
+        <w:rPr>
+          <w:rFonts w:ascii="Calibri" w:hAnsi="Calibri" w:cs="Calibri"/>
+        </w:rPr>
+        <w:t>.</w:t>
+      </w:r>
+    </w:p>
+    <w:p>
+      <w:pPr>
+        <w:rPr>
+          <w:rFonts w:ascii="Calibri" w:hAnsi="Calibri" w:cs="Calibri"/>
+        </w:rPr>
+      </w:pPr>
+    </w:p>
+    <w:p>
+      <w:pPr>
+        <w:rPr>
+          <w:rFonts w:ascii="Calibri" w:hAnsi="Calibri" w:cs="Calibri"/>
+        </w:rPr>
+      </w:pPr>
+    </w:p>
+    <w:p>
+      <w:pPr>
+        <w:pStyle w:val="berschrift3"/>
+        <w:rPr>
+          <w:rFonts w:ascii="Calibri" w:hAnsi="Calibri" w:cs="Calibri"/>
+          <w:b/>
+          <w:bCs/>
+          <w:sz w:val="24"/>
+          <w:szCs w:val="24"/>
+        </w:rPr>
+      </w:pPr>
+      <w:r>
+        <w:rPr>
+          <w:rFonts w:ascii="Calibri" w:hAnsi="Calibri" w:cs="Calibri"/>
+          <w:b/>
+          <w:bCs/>
+          <w:sz w:val="24"/>
+          <w:szCs w:val="24"/>
+        </w:rPr>
+        <w:t>2.2.1 Spannungs- und Strommessung</w:t>
+      </w:r>
+    </w:p>
+    <w:p>
+      <w:pPr>
+        <w:rPr>
+          <w:rFonts w:ascii="Calibri" w:hAnsi="Calibri" w:cs="Calibri"/>
+        </w:rPr>
+      </w:pPr>
+      <w:r>
+        <w:rPr>
+          <w:rFonts w:ascii="Calibri" w:hAnsi="Calibri" w:cs="Calibri"/>
+        </w:rPr>
+        <w:t>Für die Spannungs- und Strommessung der Ausgänge der Powerbank wird ein INA219 Current Monitor von Texas Instruments eingesetzt.</w:t>
+      </w:r>
+    </w:p>
+    <w:p>
+      <w:pPr>
+        <w:rPr>
+          <w:rFonts w:ascii="Calibri" w:hAnsi="Calibri" w:cs="Calibri"/>
+        </w:rPr>
+      </w:pPr>
+    </w:p>
+    <w:p>
+      <w:pPr>
+        <w:rPr>
+          <w:rFonts w:ascii="Calibri" w:hAnsi="Calibri" w:cs="Calibri"/>
+          <w:b/>
+          <w:bCs/>
+          <w:sz w:val="24"/>
+          <w:szCs w:val="24"/>
+        </w:rPr>
+      </w:pPr>
+      <w:r>
+        <w:rPr>
+          <w:rFonts w:ascii="Calibri" w:hAnsi="Calibri" w:cs="Calibri"/>
+        </w:rPr>
+        <w:drawing>
+          <wp:anchor distT="0" distB="0" distL="114300" distR="114300" simplePos="0" relativeHeight="251662336" behindDoc="0" locked="0" layoutInCell="1" allowOverlap="1" wp14:anchorId="0C63B5F7" wp14:editId="70FD946E">
+            <wp:simplePos x="0" y="0"/>
+            <wp:positionH relativeFrom="margin">
+              <wp:posOffset>3286125</wp:posOffset>
+            </wp:positionH>
+            <wp:positionV relativeFrom="paragraph">
+              <wp:posOffset>93027</wp:posOffset>
+            </wp:positionV>
+            <wp:extent cx="1207770" cy="382620"/>
+            <wp:effectExtent l="0" t="0" r="0" b="0"/>
+            <wp:wrapNone/>
+            <wp:docPr id="874140730" name="Grafik 1"/>
+            <wp:cNvGraphicFramePr>
+              <a:graphicFrameLocks xmlns:a="http://schemas.openxmlformats.org/drawingml/2006/main" noChangeAspect="1"/>
+            </wp:cNvGraphicFramePr>
+            <a:graphic xmlns:a="http://schemas.openxmlformats.org/drawingml/2006/main">
+              <a:graphicData uri="http://schemas.openxmlformats.org/drawingml/2006/picture">
+                <pic:pic xmlns:pic="http://schemas.openxmlformats.org/drawingml/2006/picture">
+                  <pic:nvPicPr>
+                    <pic:cNvPr id="874140730" name=""/>
+                    <pic:cNvPicPr/>
+                  </pic:nvPicPr>
+                  <pic:blipFill>
+                    <a:blip r:embed="rId13" cstate="print">
+                      <a:extLst>
+                        <a:ext uri="{28A0092B-C50C-407E-A947-70E740481C1C}">
+                          <a14:useLocalDpi xmlns:a14="http://schemas.microsoft.com/office/drawing/2010/main" val="0"/>
+                        </a:ext>
+                      </a:extLst>
+                    </a:blip>
+                    <a:stretch>
+                      <a:fillRect/>
+                    </a:stretch>
+                  </pic:blipFill>
+                  <pic:spPr>
+                    <a:xfrm>
+                      <a:off x="0" y="0"/>
+                      <a:ext cx="1207770" cy="382620"/>
+                    </a:xfrm>
+                    <a:prstGeom prst="rect">
+                      <a:avLst/>
+                    </a:prstGeom>
+                  </pic:spPr>
+                </pic:pic>
+              </a:graphicData>
+            </a:graphic>
+            <wp14:sizeRelH relativeFrom="margin">
+              <wp14:pctWidth>0</wp14:pctWidth>
+            </wp14:sizeRelH>
+            <wp14:sizeRelV relativeFrom="margin">
+              <wp14:pctHeight>0</wp14:pctHeight>
+            </wp14:sizeRelV>
+          </wp:anchor>
+        </w:drawing>
+      </w:r>
+      <w:r>
+        <w:rPr>
+          <w:rFonts w:ascii="Calibri" w:hAnsi="Calibri" w:cs="Calibri"/>
+        </w:rPr>
+        <w:drawing>
+          <wp:anchor distT="0" distB="0" distL="114300" distR="114300" simplePos="0" relativeHeight="251661312" behindDoc="0" locked="0" layoutInCell="1" allowOverlap="1" wp14:anchorId="0168B890" wp14:editId="60BDEB6D">
+            <wp:simplePos x="0" y="0"/>
+            <wp:positionH relativeFrom="margin">
+              <wp:posOffset>3438525</wp:posOffset>
+            </wp:positionH>
+            <wp:positionV relativeFrom="paragraph">
+              <wp:posOffset>3492</wp:posOffset>
+            </wp:positionV>
+            <wp:extent cx="2750084" cy="2747962"/>
+            <wp:effectExtent l="0" t="0" r="0" b="0"/>
+            <wp:wrapNone/>
+            <wp:docPr id="857950532" name="Grafik 1"/>
+            <wp:cNvGraphicFramePr>
+              <a:graphicFrameLocks xmlns:a="http://schemas.openxmlformats.org/drawingml/2006/main" noChangeAspect="1"/>
+            </wp:cNvGraphicFramePr>
+            <a:graphic xmlns:a="http://schemas.openxmlformats.org/drawingml/2006/main">
+              <a:graphicData uri="http://schemas.openxmlformats.org/drawingml/2006/picture">
+                <pic:pic xmlns:pic="http://schemas.openxmlformats.org/drawingml/2006/picture">
+                  <pic:nvPicPr>
+                    <pic:cNvPr id="857950532" name=""/>
+                    <pic:cNvPicPr/>
+                  </pic:nvPicPr>
+                  <pic:blipFill>
+                    <a:blip r:embed="rId14" cstate="print">
+                      <a:extLst>
+                        <a:ext uri="{28A0092B-C50C-407E-A947-70E740481C1C}">
+                          <a14:useLocalDpi xmlns:a14="http://schemas.microsoft.com/office/drawing/2010/main" val="0"/>
+                        </a:ext>
+                      </a:extLst>
+                    </a:blip>
+                    <a:stretch>
+                      <a:fillRect/>
+                    </a:stretch>
+                  </pic:blipFill>
+                  <pic:spPr>
+                    <a:xfrm>
+                      <a:off x="0" y="0"/>
+                      <a:ext cx="2750084" cy="2747962"/>
+                    </a:xfrm>
+                    <a:prstGeom prst="rect">
+                      <a:avLst/>
+                    </a:prstGeom>
+                  </pic:spPr>
+                </pic:pic>
+              </a:graphicData>
+            </a:graphic>
+            <wp14:sizeRelH relativeFrom="margin">
+              <wp14:pctWidth>0</wp14:pctWidth>
+            </wp14:sizeRelH>
+            <wp14:sizeRelV relativeFrom="margin">
+              <wp14:pctHeight>0</wp14:pctHeight>
+            </wp14:sizeRelV>
+          </wp:anchor>
+        </w:drawing>
+      </w:r>
+      <w:r>
+        <w:rPr>
+          <w:rFonts w:ascii="Calibri" w:hAnsi="Calibri" w:cs="Calibri"/>
+          <w:b/>
+          <w:bCs/>
+          <w:sz w:val="24"/>
+          <w:szCs w:val="24"/>
+        </w:rPr>
+        <w:t>INA219</w:t>
+      </w:r>
+    </w:p>
+    <w:p>
+      <w:pPr>
+        <w:rPr>
+          <w:rFonts w:ascii="Calibri" w:hAnsi="Calibri" w:cs="Calibri"/>
+        </w:rPr>
+      </w:pPr>
+      <w:hyperlink r:id="rId15" w:history="1">
+        <w:r>
+          <w:rPr>
+            <w:rStyle w:val="Hyperlink"/>
+            <w:rFonts w:ascii="Calibri" w:hAnsi="Calibri" w:cs="Calibri"/>
+          </w:rPr>
+          <w:t>https://www.ti.com/product/de-de/INA219#tech-docs</w:t>
+        </w:r>
+      </w:hyperlink>
+    </w:p>
+    <w:p>
+      <w:pPr>
+        <w:rPr>
+          <w:rFonts w:ascii="Calibri" w:hAnsi="Calibri" w:cs="Calibri"/>
+        </w:rPr>
+      </w:pPr>
+    </w:p>
+    <w:p>
+      <w:pPr>
+        <w:spacing w:after="120"/>
+        <w:rPr>
+          <w:rFonts w:ascii="Calibri" w:hAnsi="Calibri" w:cs="Calibri"/>
+          <w:b/>
+          <w:bCs/>
+        </w:rPr>
+      </w:pPr>
+      <w:r>
+        <w:rPr>
+          <w:rFonts w:ascii="Calibri" w:hAnsi="Calibri" w:cs="Calibri"/>
+          <w:b/>
+          <w:bCs/>
+        </w:rPr>
+        <w:t>Wichtige Kenndaten:</w:t>
+      </w:r>
+    </w:p>
+    <w:p>
+      <w:pPr>
+        <w:pStyle w:val="Listenabsatz"/>
+        <w:numPr>
+          <w:ilvl w:val="0"/>
+          <w:numId w:val="9"/>
+        </w:numPr>
+        <w:spacing w:after="120"/>
+        <w:rPr>
+          <w:rFonts w:ascii="Calibri" w:hAnsi="Calibri" w:cs="Calibri"/>
+        </w:rPr>
+      </w:pPr>
+      <w:r>
+        <w:rPr>
+          <w:rFonts w:ascii="Calibri" w:hAnsi="Calibri" w:cs="Calibri"/>
+        </w:rPr>
+        <w:t>I</w:t>
+      </w:r>
+      <w:r>
+        <w:rPr>
+          <w:rFonts w:ascii="Calibri" w:hAnsi="Calibri" w:cs="Calibri"/>
+          <w:vertAlign w:val="superscript"/>
+        </w:rPr>
+        <w:t>2</w:t>
+      </w:r>
+      <w:r>
+        <w:rPr>
+          <w:rFonts w:ascii="Calibri" w:hAnsi="Calibri" w:cs="Calibri"/>
+        </w:rPr>
+        <w:t>C</w:t>
+      </w:r>
+    </w:p>
+    <w:p>
+      <w:pPr>
+        <w:pStyle w:val="Listenabsatz"/>
+        <w:numPr>
+          <w:ilvl w:val="0"/>
+          <w:numId w:val="9"/>
+        </w:numPr>
+        <w:spacing w:after="120"/>
+        <w:rPr>
+          <w:rFonts w:ascii="Calibri" w:hAnsi="Calibri" w:cs="Calibri"/>
+        </w:rPr>
+      </w:pPr>
+      <w:r>
+        <w:rPr>
+          <w:rFonts w:ascii="Calibri" w:hAnsi="Calibri" w:cs="Calibri"/>
+        </w:rPr>
+        <w:t>12-Bit ADC</w:t>
+      </w:r>
+    </w:p>
+    <w:p>
+      <w:pPr>
+        <w:pStyle w:val="Listenabsatz"/>
+        <w:numPr>
+          <w:ilvl w:val="0"/>
+          <w:numId w:val="9"/>
+        </w:numPr>
+        <w:spacing w:after="120"/>
+        <w:rPr>
+          <w:rFonts w:ascii="Calibri" w:hAnsi="Calibri" w:cs="Calibri"/>
+        </w:rPr>
+      </w:pPr>
+      <w:r>
+        <w:rPr>
+          <w:rFonts w:ascii="Calibri" w:hAnsi="Calibri" w:cs="Calibri"/>
+        </w:rPr>
+        <w:t>Vs – 3,3V</w:t>
+      </w:r>
+    </w:p>
+    <w:p>
+      <w:pPr>
+        <w:rPr>
+          <w:rFonts w:ascii="Calibri" w:hAnsi="Calibri" w:cs="Calibri"/>
+        </w:rPr>
+      </w:pPr>
     </w:p>
     <w:p>
       <w:pPr>
@@ -2400,60 +2809,24 @@
         <w:szCs w:val="18"/>
         <w:lang w:val="en-US"/>
       </w:rPr>
-      <w:t xml:space="preserve">Smart </w:t>
+      <w:t xml:space="preserve">Smart Powerbank </w:t>
     </w:r>
-    <w:proofErr w:type="spellStart"/>
     <w:r>
       <w:rPr>
         <w:sz w:val="18"/>
         <w:szCs w:val="18"/>
         <w:lang w:val="en-US"/>
       </w:rPr>
-      <w:t>Powerbank</w:t>
+      <w:tab/>
     </w:r>
-    <w:proofErr w:type="spellEnd"/>
     <w:r>
       <w:rPr>
         <w:sz w:val="18"/>
         <w:szCs w:val="18"/>
         <w:lang w:val="en-US"/>
       </w:rPr>
-      <w:t xml:space="preserve"> </w:t>
-    </w:r>
-    <w:r>
-      <w:rPr>
-        <w:sz w:val="18"/>
-        <w:szCs w:val="18"/>
-        <w:lang w:val="en-US"/>
-      </w:rPr>
       <w:tab/>
-    </w:r>
-    <w:r>
-      <w:rPr>
-        <w:sz w:val="18"/>
-        <w:szCs w:val="18"/>
-        <w:lang w:val="en-US"/>
-      </w:rPr>
-      <w:tab/>
-      <w:t xml:space="preserve">Jukic M. &amp; </w:t>
-    </w:r>
-    <w:proofErr w:type="spellStart"/>
-    <w:r>
-      <w:rPr>
-        <w:sz w:val="18"/>
-        <w:szCs w:val="18"/>
-        <w:lang w:val="en-US"/>
-      </w:rPr>
-      <w:t>Sayfutdinov</w:t>
-    </w:r>
-    <w:proofErr w:type="spellEnd"/>
-    <w:r>
-      <w:rPr>
-        <w:sz w:val="18"/>
-        <w:szCs w:val="18"/>
-        <w:lang w:val="en-US"/>
-      </w:rPr>
-      <w:t xml:space="preserve"> D.</w:t>
+      <w:t>Jukic M. &amp; Sayfutdinov D.</w:t>
     </w:r>
   </w:p>
 </w:hdr>
@@ -2476,60 +2849,24 @@
         <w:szCs w:val="18"/>
         <w:lang w:val="en-US"/>
       </w:rPr>
-      <w:t xml:space="preserve">Smart </w:t>
+      <w:t xml:space="preserve">Smart Powerbank </w:t>
     </w:r>
-    <w:proofErr w:type="spellStart"/>
     <w:r>
       <w:rPr>
         <w:sz w:val="18"/>
         <w:szCs w:val="18"/>
         <w:lang w:val="en-US"/>
       </w:rPr>
-      <w:t>Powerbank</w:t>
+      <w:tab/>
     </w:r>
-    <w:proofErr w:type="spellEnd"/>
     <w:r>
       <w:rPr>
         <w:sz w:val="18"/>
         <w:szCs w:val="18"/>
         <w:lang w:val="en-US"/>
       </w:rPr>
-      <w:t xml:space="preserve"> </w:t>
-    </w:r>
-    <w:r>
-      <w:rPr>
-        <w:sz w:val="18"/>
-        <w:szCs w:val="18"/>
-        <w:lang w:val="en-US"/>
-      </w:rPr>
       <w:tab/>
-    </w:r>
-    <w:r>
-      <w:rPr>
-        <w:sz w:val="18"/>
-        <w:szCs w:val="18"/>
-        <w:lang w:val="en-US"/>
-      </w:rPr>
-      <w:tab/>
-      <w:t xml:space="preserve">Jukic M. &amp; </w:t>
-    </w:r>
-    <w:proofErr w:type="spellStart"/>
-    <w:r>
-      <w:rPr>
-        <w:sz w:val="18"/>
-        <w:szCs w:val="18"/>
-        <w:lang w:val="en-US"/>
-      </w:rPr>
-      <w:t>Sayfutdinov</w:t>
-    </w:r>
-    <w:proofErr w:type="spellEnd"/>
-    <w:r>
-      <w:rPr>
-        <w:sz w:val="18"/>
-        <w:szCs w:val="18"/>
-        <w:lang w:val="en-US"/>
-      </w:rPr>
-      <w:t xml:space="preserve"> D.</w:t>
+      <w:t>Jukic M. &amp; Sayfutdinov D.</w:t>
     </w:r>
   </w:p>
 </w:hdr>
@@ -2538,6 +2875,119 @@
 <file path=word/numbering.xml><?xml version="1.0" encoding="utf-8"?>
 <w:numbering xmlns:wpc="http://schemas.microsoft.com/office/word/2010/wordprocessingCanvas" xmlns:cx="http://schemas.microsoft.com/office/drawing/2014/chartex" xmlns:cx1="http://schemas.microsoft.com/office/drawing/2015/9/8/chartex" xmlns:cx2="http://schemas.microsoft.com/office/drawing/2015/10/21/chartex" xmlns:cx3="http://schemas.microsoft.com/office/drawing/2016/5/9/chartex" xmlns:cx4="http://schemas.microsoft.com/office/drawing/2016/5/10/chartex" xmlns:cx5="http://schemas.microsoft.com/office/drawing/2016/5/11/chartex" xmlns:cx6="http://schemas.microsoft.com/office/drawing/2016/5/12/chartex" xmlns:cx7="http://schemas.microsoft.com/office/drawing/2016/5/13/chartex" xmlns:cx8="http://schemas.microsoft.com/office/drawing/2016/5/14/chartex" xmlns:mc="http://schemas.openxmlformats.org/markup-compatibility/2006" xmlns:aink="http://schemas.microsoft.com/office/drawing/2016/ink" xmlns:am3d="http://schemas.microsoft.com/office/drawing/2017/model3d" xmlns:o="urn:schemas-microsoft-com:office:office" xmlns:oel="http://schemas.microsoft.com/office/2019/extlst" xmlns:r="http://schemas.openxmlformats.org/officeDocument/2006/relationships" xmlns:m="http://schemas.openxmlformats.org/officeDocument/2006/math" xmlns:v="urn:schemas-microsoft-com:vml" xmlns:wp14="http://schemas.microsoft.com/office/word/2010/wordprocessingDrawing" xmlns:wp="http://schemas.openxmlformats.org/drawingml/2006/wordprocessingDrawing" xmlns:w10="urn:schemas-microsoft-com:office:word" xmlns:w="http://schemas.openxmlformats.org/wordprocessingml/2006/main" xmlns:w14="http://schemas.microsoft.com/office/word/2010/wordml" xmlns:w15="http://schemas.microsoft.com/office/word/2012/wordml" xmlns:w16cex="http://schemas.microsoft.com/office/word/2018/wordml/cex" xmlns:w16cid="http://schemas.microsoft.com/office/word/2016/wordml/cid" xmlns:w16="http://schemas.microsoft.com/office/word/2018/wordml" xmlns:w16du="http://schemas.microsoft.com/office/word/2023/wordml/word16du" xmlns:w16sdtdh="http://schemas.microsoft.com/office/word/2020/wordml/sdtdatahash" xmlns:w16sdtfl="http://schemas.microsoft.com/office/word/2024/wordml/sdtformatlock" xmlns:w16se="http://schemas.microsoft.com/office/word/2015/wordml/symex" xmlns:wpg="http://schemas.microsoft.com/office/word/2010/wordprocessingGroup" xmlns:wpi="http://schemas.microsoft.com/office/word/2010/wordprocessingInk" xmlns:wne="http://schemas.microsoft.com/office/word/2006/wordml" xmlns:wps="http://schemas.microsoft.com/office/word/2010/wordprocessingShape" mc:Ignorable="w14 w15 w16se w16cid w16 w16cex w16sdtdh w16sdtfl w16du wp14">
   <w:abstractNum w:abstractNumId="0" w15:restartNumberingAfterBreak="0">
+    <w:nsid w:val="11C15A3C"/>
+    <w:multiLevelType w:val="hybridMultilevel"/>
+    <w:tmpl w:val="CFBAC5DE"/>
+    <w:lvl w:ilvl="0" w:tplc="04070001">
+      <w:start w:val="1"/>
+      <w:numFmt w:val="bullet"/>
+      <w:lvlText w:val=""/>
+      <w:lvlJc w:val="left"/>
+      <w:pPr>
+        <w:ind w:left="720" w:hanging="360"/>
+      </w:pPr>
+      <w:rPr>
+        <w:rFonts w:ascii="Symbol" w:hAnsi="Symbol" w:hint="default"/>
+      </w:rPr>
+    </w:lvl>
+    <w:lvl w:ilvl="1" w:tplc="04070003" w:tentative="1">
+      <w:start w:val="1"/>
+      <w:numFmt w:val="bullet"/>
+      <w:lvlText w:val="o"/>
+      <w:lvlJc w:val="left"/>
+      <w:pPr>
+        <w:ind w:left="1440" w:hanging="360"/>
+      </w:pPr>
+      <w:rPr>
+        <w:rFonts w:ascii="Courier New" w:hAnsi="Courier New" w:cs="Courier New" w:hint="default"/>
+      </w:rPr>
+    </w:lvl>
+    <w:lvl w:ilvl="2" w:tplc="04070005" w:tentative="1">
+      <w:start w:val="1"/>
+      <w:numFmt w:val="bullet"/>
+      <w:lvlText w:val=""/>
+      <w:lvlJc w:val="left"/>
+      <w:pPr>
+        <w:ind w:left="2160" w:hanging="360"/>
+      </w:pPr>
+      <w:rPr>
+        <w:rFonts w:ascii="Wingdings" w:hAnsi="Wingdings" w:hint="default"/>
+      </w:rPr>
+    </w:lvl>
+    <w:lvl w:ilvl="3" w:tplc="04070001" w:tentative="1">
+      <w:start w:val="1"/>
+      <w:numFmt w:val="bullet"/>
+      <w:lvlText w:val=""/>
+      <w:lvlJc w:val="left"/>
+      <w:pPr>
+        <w:ind w:left="2880" w:hanging="360"/>
+      </w:pPr>
+      <w:rPr>
+        <w:rFonts w:ascii="Symbol" w:hAnsi="Symbol" w:hint="default"/>
+      </w:rPr>
+    </w:lvl>
+    <w:lvl w:ilvl="4" w:tplc="04070003" w:tentative="1">
+      <w:start w:val="1"/>
+      <w:numFmt w:val="bullet"/>
+      <w:lvlText w:val="o"/>
+      <w:lvlJc w:val="left"/>
+      <w:pPr>
+        <w:ind w:left="3600" w:hanging="360"/>
+      </w:pPr>
+      <w:rPr>
+        <w:rFonts w:ascii="Courier New" w:hAnsi="Courier New" w:cs="Courier New" w:hint="default"/>
+      </w:rPr>
+    </w:lvl>
+    <w:lvl w:ilvl="5" w:tplc="04070005" w:tentative="1">
+      <w:start w:val="1"/>
+      <w:numFmt w:val="bullet"/>
+      <w:lvlText w:val=""/>
+      <w:lvlJc w:val="left"/>
+      <w:pPr>
+        <w:ind w:left="4320" w:hanging="360"/>
+      </w:pPr>
+      <w:rPr>
+        <w:rFonts w:ascii="Wingdings" w:hAnsi="Wingdings" w:hint="default"/>
+      </w:rPr>
+    </w:lvl>
+    <w:lvl w:ilvl="6" w:tplc="04070001" w:tentative="1">
+      <w:start w:val="1"/>
+      <w:numFmt w:val="bullet"/>
+      <w:lvlText w:val=""/>
+      <w:lvlJc w:val="left"/>
+      <w:pPr>
+        <w:ind w:left="5040" w:hanging="360"/>
+      </w:pPr>
+      <w:rPr>
+        <w:rFonts w:ascii="Symbol" w:hAnsi="Symbol" w:hint="default"/>
+      </w:rPr>
+    </w:lvl>
+    <w:lvl w:ilvl="7" w:tplc="04070003" w:tentative="1">
+      <w:start w:val="1"/>
+      <w:numFmt w:val="bullet"/>
+      <w:lvlText w:val="o"/>
+      <w:lvlJc w:val="left"/>
+      <w:pPr>
+        <w:ind w:left="5760" w:hanging="360"/>
+      </w:pPr>
+      <w:rPr>
+        <w:rFonts w:ascii="Courier New" w:hAnsi="Courier New" w:cs="Courier New" w:hint="default"/>
+      </w:rPr>
+    </w:lvl>
+    <w:lvl w:ilvl="8" w:tplc="04070005" w:tentative="1">
+      <w:start w:val="1"/>
+      <w:numFmt w:val="bullet"/>
+      <w:lvlText w:val=""/>
+      <w:lvlJc w:val="left"/>
+      <w:pPr>
+        <w:ind w:left="6480" w:hanging="360"/>
+      </w:pPr>
+      <w:rPr>
+        <w:rFonts w:ascii="Wingdings" w:hAnsi="Wingdings" w:hint="default"/>
+      </w:rPr>
+    </w:lvl>
+  </w:abstractNum>
+  <w:abstractNum w:abstractNumId="1" w15:restartNumberingAfterBreak="0">
     <w:nsid w:val="17B126EF"/>
     <w:multiLevelType w:val="hybridMultilevel"/>
     <w:tmpl w:val="92185054"/>
@@ -2626,7 +3076,120 @@
       </w:pPr>
     </w:lvl>
   </w:abstractNum>
-  <w:abstractNum w:abstractNumId="1" w15:restartNumberingAfterBreak="0">
+  <w:abstractNum w:abstractNumId="2" w15:restartNumberingAfterBreak="0">
+    <w:nsid w:val="23B91985"/>
+    <w:multiLevelType w:val="hybridMultilevel"/>
+    <w:tmpl w:val="574A2D88"/>
+    <w:lvl w:ilvl="0" w:tplc="04070001">
+      <w:start w:val="1"/>
+      <w:numFmt w:val="bullet"/>
+      <w:lvlText w:val=""/>
+      <w:lvlJc w:val="left"/>
+      <w:pPr>
+        <w:ind w:left="720" w:hanging="360"/>
+      </w:pPr>
+      <w:rPr>
+        <w:rFonts w:ascii="Symbol" w:hAnsi="Symbol" w:hint="default"/>
+      </w:rPr>
+    </w:lvl>
+    <w:lvl w:ilvl="1" w:tplc="04070003" w:tentative="1">
+      <w:start w:val="1"/>
+      <w:numFmt w:val="bullet"/>
+      <w:lvlText w:val="o"/>
+      <w:lvlJc w:val="left"/>
+      <w:pPr>
+        <w:ind w:left="1440" w:hanging="360"/>
+      </w:pPr>
+      <w:rPr>
+        <w:rFonts w:ascii="Courier New" w:hAnsi="Courier New" w:cs="Courier New" w:hint="default"/>
+      </w:rPr>
+    </w:lvl>
+    <w:lvl w:ilvl="2" w:tplc="04070005" w:tentative="1">
+      <w:start w:val="1"/>
+      <w:numFmt w:val="bullet"/>
+      <w:lvlText w:val=""/>
+      <w:lvlJc w:val="left"/>
+      <w:pPr>
+        <w:ind w:left="2160" w:hanging="360"/>
+      </w:pPr>
+      <w:rPr>
+        <w:rFonts w:ascii="Wingdings" w:hAnsi="Wingdings" w:hint="default"/>
+      </w:rPr>
+    </w:lvl>
+    <w:lvl w:ilvl="3" w:tplc="04070001" w:tentative="1">
+      <w:start w:val="1"/>
+      <w:numFmt w:val="bullet"/>
+      <w:lvlText w:val=""/>
+      <w:lvlJc w:val="left"/>
+      <w:pPr>
+        <w:ind w:left="2880" w:hanging="360"/>
+      </w:pPr>
+      <w:rPr>
+        <w:rFonts w:ascii="Symbol" w:hAnsi="Symbol" w:hint="default"/>
+      </w:rPr>
+    </w:lvl>
+    <w:lvl w:ilvl="4" w:tplc="04070003" w:tentative="1">
+      <w:start w:val="1"/>
+      <w:numFmt w:val="bullet"/>
+      <w:lvlText w:val="o"/>
+      <w:lvlJc w:val="left"/>
+      <w:pPr>
+        <w:ind w:left="3600" w:hanging="360"/>
+      </w:pPr>
+      <w:rPr>
+        <w:rFonts w:ascii="Courier New" w:hAnsi="Courier New" w:cs="Courier New" w:hint="default"/>
+      </w:rPr>
+    </w:lvl>
+    <w:lvl w:ilvl="5" w:tplc="04070005" w:tentative="1">
+      <w:start w:val="1"/>
+      <w:numFmt w:val="bullet"/>
+      <w:lvlText w:val=""/>
+      <w:lvlJc w:val="left"/>
+      <w:pPr>
+        <w:ind w:left="4320" w:hanging="360"/>
+      </w:pPr>
+      <w:rPr>
+        <w:rFonts w:ascii="Wingdings" w:hAnsi="Wingdings" w:hint="default"/>
+      </w:rPr>
+    </w:lvl>
+    <w:lvl w:ilvl="6" w:tplc="04070001" w:tentative="1">
+      <w:start w:val="1"/>
+      <w:numFmt w:val="bullet"/>
+      <w:lvlText w:val=""/>
+      <w:lvlJc w:val="left"/>
+      <w:pPr>
+        <w:ind w:left="5040" w:hanging="360"/>
+      </w:pPr>
+      <w:rPr>
+        <w:rFonts w:ascii="Symbol" w:hAnsi="Symbol" w:hint="default"/>
+      </w:rPr>
+    </w:lvl>
+    <w:lvl w:ilvl="7" w:tplc="04070003" w:tentative="1">
+      <w:start w:val="1"/>
+      <w:numFmt w:val="bullet"/>
+      <w:lvlText w:val="o"/>
+      <w:lvlJc w:val="left"/>
+      <w:pPr>
+        <w:ind w:left="5760" w:hanging="360"/>
+      </w:pPr>
+      <w:rPr>
+        <w:rFonts w:ascii="Courier New" w:hAnsi="Courier New" w:cs="Courier New" w:hint="default"/>
+      </w:rPr>
+    </w:lvl>
+    <w:lvl w:ilvl="8" w:tplc="04070005" w:tentative="1">
+      <w:start w:val="1"/>
+      <w:numFmt w:val="bullet"/>
+      <w:lvlText w:val=""/>
+      <w:lvlJc w:val="left"/>
+      <w:pPr>
+        <w:ind w:left="6480" w:hanging="360"/>
+      </w:pPr>
+      <w:rPr>
+        <w:rFonts w:ascii="Wingdings" w:hAnsi="Wingdings" w:hint="default"/>
+      </w:rPr>
+    </w:lvl>
+  </w:abstractNum>
+  <w:abstractNum w:abstractNumId="3" w15:restartNumberingAfterBreak="0">
     <w:nsid w:val="26C749AD"/>
     <w:multiLevelType w:val="hybridMultilevel"/>
     <w:tmpl w:val="148477F0"/>
@@ -2715,7 +3278,7 @@
       </w:pPr>
     </w:lvl>
   </w:abstractNum>
-  <w:abstractNum w:abstractNumId="2" w15:restartNumberingAfterBreak="0">
+  <w:abstractNum w:abstractNumId="4" w15:restartNumberingAfterBreak="0">
     <w:nsid w:val="33B84AE6"/>
     <w:multiLevelType w:val="hybridMultilevel"/>
     <w:tmpl w:val="A3207E00"/>
@@ -2804,7 +3367,120 @@
       </w:pPr>
     </w:lvl>
   </w:abstractNum>
-  <w:abstractNum w:abstractNumId="3" w15:restartNumberingAfterBreak="0">
+  <w:abstractNum w:abstractNumId="5" w15:restartNumberingAfterBreak="0">
+    <w:nsid w:val="38CD5DC5"/>
+    <w:multiLevelType w:val="hybridMultilevel"/>
+    <w:tmpl w:val="37AAEE0C"/>
+    <w:lvl w:ilvl="0" w:tplc="04070001">
+      <w:start w:val="1"/>
+      <w:numFmt w:val="bullet"/>
+      <w:lvlText w:val=""/>
+      <w:lvlJc w:val="left"/>
+      <w:pPr>
+        <w:ind w:left="720" w:hanging="360"/>
+      </w:pPr>
+      <w:rPr>
+        <w:rFonts w:ascii="Symbol" w:hAnsi="Symbol" w:hint="default"/>
+      </w:rPr>
+    </w:lvl>
+    <w:lvl w:ilvl="1" w:tplc="04070003" w:tentative="1">
+      <w:start w:val="1"/>
+      <w:numFmt w:val="bullet"/>
+      <w:lvlText w:val="o"/>
+      <w:lvlJc w:val="left"/>
+      <w:pPr>
+        <w:ind w:left="1440" w:hanging="360"/>
+      </w:pPr>
+      <w:rPr>
+        <w:rFonts w:ascii="Courier New" w:hAnsi="Courier New" w:cs="Courier New" w:hint="default"/>
+      </w:rPr>
+    </w:lvl>
+    <w:lvl w:ilvl="2" w:tplc="04070005" w:tentative="1">
+      <w:start w:val="1"/>
+      <w:numFmt w:val="bullet"/>
+      <w:lvlText w:val=""/>
+      <w:lvlJc w:val="left"/>
+      <w:pPr>
+        <w:ind w:left="2160" w:hanging="360"/>
+      </w:pPr>
+      <w:rPr>
+        <w:rFonts w:ascii="Wingdings" w:hAnsi="Wingdings" w:hint="default"/>
+      </w:rPr>
+    </w:lvl>
+    <w:lvl w:ilvl="3" w:tplc="04070001" w:tentative="1">
+      <w:start w:val="1"/>
+      <w:numFmt w:val="bullet"/>
+      <w:lvlText w:val=""/>
+      <w:lvlJc w:val="left"/>
+      <w:pPr>
+        <w:ind w:left="2880" w:hanging="360"/>
+      </w:pPr>
+      <w:rPr>
+        <w:rFonts w:ascii="Symbol" w:hAnsi="Symbol" w:hint="default"/>
+      </w:rPr>
+    </w:lvl>
+    <w:lvl w:ilvl="4" w:tplc="04070003" w:tentative="1">
+      <w:start w:val="1"/>
+      <w:numFmt w:val="bullet"/>
+      <w:lvlText w:val="o"/>
+      <w:lvlJc w:val="left"/>
+      <w:pPr>
+        <w:ind w:left="3600" w:hanging="360"/>
+      </w:pPr>
+      <w:rPr>
+        <w:rFonts w:ascii="Courier New" w:hAnsi="Courier New" w:cs="Courier New" w:hint="default"/>
+      </w:rPr>
+    </w:lvl>
+    <w:lvl w:ilvl="5" w:tplc="04070005" w:tentative="1">
+      <w:start w:val="1"/>
+      <w:numFmt w:val="bullet"/>
+      <w:lvlText w:val=""/>
+      <w:lvlJc w:val="left"/>
+      <w:pPr>
+        <w:ind w:left="4320" w:hanging="360"/>
+      </w:pPr>
+      <w:rPr>
+        <w:rFonts w:ascii="Wingdings" w:hAnsi="Wingdings" w:hint="default"/>
+      </w:rPr>
+    </w:lvl>
+    <w:lvl w:ilvl="6" w:tplc="04070001" w:tentative="1">
+      <w:start w:val="1"/>
+      <w:numFmt w:val="bullet"/>
+      <w:lvlText w:val=""/>
+      <w:lvlJc w:val="left"/>
+      <w:pPr>
+        <w:ind w:left="5040" w:hanging="360"/>
+      </w:pPr>
+      <w:rPr>
+        <w:rFonts w:ascii="Symbol" w:hAnsi="Symbol" w:hint="default"/>
+      </w:rPr>
+    </w:lvl>
+    <w:lvl w:ilvl="7" w:tplc="04070003" w:tentative="1">
+      <w:start w:val="1"/>
+      <w:numFmt w:val="bullet"/>
+      <w:lvlText w:val="o"/>
+      <w:lvlJc w:val="left"/>
+      <w:pPr>
+        <w:ind w:left="5760" w:hanging="360"/>
+      </w:pPr>
+      <w:rPr>
+        <w:rFonts w:ascii="Courier New" w:hAnsi="Courier New" w:cs="Courier New" w:hint="default"/>
+      </w:rPr>
+    </w:lvl>
+    <w:lvl w:ilvl="8" w:tplc="04070005" w:tentative="1">
+      <w:start w:val="1"/>
+      <w:numFmt w:val="bullet"/>
+      <w:lvlText w:val=""/>
+      <w:lvlJc w:val="left"/>
+      <w:pPr>
+        <w:ind w:left="6480" w:hanging="360"/>
+      </w:pPr>
+      <w:rPr>
+        <w:rFonts w:ascii="Wingdings" w:hAnsi="Wingdings" w:hint="default"/>
+      </w:rPr>
+    </w:lvl>
+  </w:abstractNum>
+  <w:abstractNum w:abstractNumId="6" w15:restartNumberingAfterBreak="0">
     <w:nsid w:val="3A133429"/>
     <w:multiLevelType w:val="hybridMultilevel"/>
     <w:tmpl w:val="9CAA8E46"/>
@@ -2917,7 +3593,7 @@
       </w:rPr>
     </w:lvl>
   </w:abstractNum>
-  <w:abstractNum w:abstractNumId="4" w15:restartNumberingAfterBreak="0">
+  <w:abstractNum w:abstractNumId="7" w15:restartNumberingAfterBreak="0">
     <w:nsid w:val="524A2F7F"/>
     <w:multiLevelType w:val="hybridMultilevel"/>
     <w:tmpl w:val="68284574"/>
@@ -3030,7 +3706,7 @@
       </w:rPr>
     </w:lvl>
   </w:abstractNum>
-  <w:abstractNum w:abstractNumId="5" w15:restartNumberingAfterBreak="0">
+  <w:abstractNum w:abstractNumId="8" w15:restartNumberingAfterBreak="0">
     <w:nsid w:val="6FE43F19"/>
     <w:multiLevelType w:val="hybridMultilevel"/>
     <w:tmpl w:val="45DCA03E"/>
@@ -3144,22 +3820,31 @@
     </w:lvl>
   </w:abstractNum>
   <w:num w:numId="1" w16cid:durableId="697122810">
+    <w:abstractNumId w:val="3"/>
+  </w:num>
+  <w:num w:numId="2" w16cid:durableId="393772565">
     <w:abstractNumId w:val="1"/>
   </w:num>
-  <w:num w:numId="2" w16cid:durableId="393772565">
+  <w:num w:numId="3" w16cid:durableId="2000570447">
+    <w:abstractNumId w:val="4"/>
+  </w:num>
+  <w:num w:numId="4" w16cid:durableId="915750949">
+    <w:abstractNumId w:val="8"/>
+  </w:num>
+  <w:num w:numId="5" w16cid:durableId="960187745">
+    <w:abstractNumId w:val="7"/>
+  </w:num>
+  <w:num w:numId="6" w16cid:durableId="1768966830">
+    <w:abstractNumId w:val="6"/>
+  </w:num>
+  <w:num w:numId="7" w16cid:durableId="1997294543">
     <w:abstractNumId w:val="0"/>
   </w:num>
-  <w:num w:numId="3" w16cid:durableId="2000570447">
-    <w:abstractNumId w:val="2"/>
-  </w:num>
-  <w:num w:numId="4" w16cid:durableId="915750949">
+  <w:num w:numId="8" w16cid:durableId="1517844215">
     <w:abstractNumId w:val="5"/>
   </w:num>
-  <w:num w:numId="5" w16cid:durableId="960187745">
-    <w:abstractNumId w:val="4"/>
-  </w:num>
-  <w:num w:numId="6" w16cid:durableId="1768966830">
-    <w:abstractNumId w:val="3"/>
+  <w:num w:numId="9" w16cid:durableId="1560242687">
+    <w:abstractNumId w:val="2"/>
   </w:num>
 </w:numbering>
 </file>
@@ -3612,7 +4297,6 @@
     <w:next w:val="Standard"/>
     <w:link w:val="berschrift3Zchn"/>
     <w:uiPriority w:val="9"/>
-    <w:semiHidden/>
     <w:unhideWhenUsed/>
     <w:qFormat/>
     <w:rsid w:val="00CA45CA"/>
@@ -3817,7 +4501,6 @@
     <w:basedOn w:val="Absatz-Standardschriftart"/>
     <w:link w:val="berschrift3"/>
     <w:uiPriority w:val="9"/>
-    <w:semiHidden/>
     <w:rsid w:val="00CA45CA"/>
     <w:rPr>
       <w:rFonts w:eastAsiaTheme="majorEastAsia" w:cstheme="majorBidi"/>
@@ -4184,6 +4867,18 @@
       <w:spacing w:line="240" w:lineRule="auto"/>
     </w:pPr>
   </w:style>
+  <w:style w:type="character" w:styleId="NichtaufgelsteErwhnung">
+    <w:name w:val="Unresolved Mention"/>
+    <w:basedOn w:val="Absatz-Standardschriftart"/>
+    <w:uiPriority w:val="99"/>
+    <w:semiHidden/>
+    <w:unhideWhenUsed/>
+    <w:rsid w:val="004B3709"/>
+    <w:rPr>
+      <w:color w:val="605E5C"/>
+      <w:shd w:val="clear" w:color="auto" w:fill="E1DFDD"/>
+    </w:rPr>
+  </w:style>
 </w:styles>
 </file>
 
@@ -4480,4 +5175,16 @@
     </a:ext>
   </a:extLst>
 </a:theme>
+</file>
+
+<file path=customXml/item1.xml><?xml version="1.0" encoding="utf-8"?>
+<b:Sources xmlns:b="http://schemas.openxmlformats.org/officeDocument/2006/bibliography" xmlns="http://schemas.openxmlformats.org/officeDocument/2006/bibliography" SelectedStyle="\APASixthEditionOfficeOnline.xsl" StyleName="APA" Version="6"/>
+</file>
+
+<file path=customXml/itemProps1.xml><?xml version="1.0" encoding="utf-8"?>
+<ds:datastoreItem xmlns:ds="http://schemas.openxmlformats.org/officeDocument/2006/customXml" ds:itemID="{53269D07-2D79-4390-8A91-24DE5D257272}">
+  <ds:schemaRefs>
+    <ds:schemaRef ds:uri="http://schemas.openxmlformats.org/officeDocument/2006/bibliography"/>
+  </ds:schemaRefs>
+</ds:datastoreItem>
 </file>
</xml_diff>